<commit_message>
Rework docs: remove the Python simulator; plain-language, tag-described
Per request: this is now a documentation-only pack for use with the reader's
own HIMA SILworX offline simulation.

- Removed the Python simulator entirely (pss_sim.py, pss_cli.py, scenarios.py,
  data/cause_effect.json, .gitignore) and the two simulator-specific docs
  (old 03 Test Procedure, 05 How to use the simulator).
- Added docs/00_TAG_GLOSSARY.md: a plain-English description of every tag.
- Rewrote all remaining docs at a high-school reading level, removed every
  reference to the Python simulator, and added a short description next to
  every tag (matching the glossary).
- Renumbered: 00 glossary, 01 system & C&E, 02 hutch search, 03 program logic
  reference (was 04), 04 SILworX offline test procedure (was 06).
- Regenerated all Word (.docx) versions to match.

https://claude.ai/code/session_01B7Wzzk93u6jpLVLM53Apna
</commit_message>
<xml_diff>
--- a/B10E-PSS-Simulator/docs-word/01_SYSTEM_AND_CAUSE_EFFECT.docx
+++ b/B10E-PSS-Simulator/docs-word/01_SYSTEM_AND_CAUSE_EFFECT.docx
@@ -7,12 +7,12 @@
         <w:pStyle w:val="Heading1"/>
       </w:pPr>
       <w:r>
-        <w:t>1 · The system, and how to read the Cause &amp; Effect matrix</w:t>
+        <w:t>1 · System, and how to read the Cause &amp; Effect</w:t>
       </w:r>
     </w:p>
     <w:p>
       <w:r>
-        <w:t>*Audience: a junior technical-support engineer who has not seen this system before.*</w:t>
+        <w:t>*This document is the beginner's primer. It explains what the safety system protects against, the idea of "causes" and "effects", what fail-safe means, how voting works, and gives a one-line summary of every safety function (SIF). Read document 00 (the Tag glossary) first, then read this.*</w:t>
       </w:r>
     </w:p>
     <w:p>
@@ -42,7 +42,7 @@
         <w:t>synchrotron beamline</w:t>
       </w:r>
       <w:r>
-        <w:t xml:space="preserve">. Part of it is a shielded room called a </w:t>
+        <w:t xml:space="preserve"> (a machine that makes a very bright X-ray beam). Part of it is a shielded room called a </w:t>
       </w:r>
       <w:r>
         <w:rPr>
@@ -51,7 +51,7 @@
         <w:t>hutch</w:t>
       </w:r>
       <w:r>
-        <w:t xml:space="preserve">. Inside the hutch there are hazards that can </w:t>
+        <w:t xml:space="preserve"> (a thick-walled room you can walk into; the walls block radiation). Inside the hutch there are hazards that can </w:t>
       </w:r>
       <w:r>
         <w:rPr>
@@ -74,7 +74,7 @@
         <w:t>Ionising radiation</w:t>
       </w:r>
       <w:r>
-        <w:t xml:space="preserve"> from the electron source / X-ray beam,</w:t>
+        <w:t xml:space="preserve"> from the electron source and X-ray beam,</w:t>
       </w:r>
     </w:p>
     <w:p>
@@ -88,7 +88,7 @@
         <w:t>RF (radio-frequency) power</w:t>
       </w:r>
       <w:r>
-        <w:t>,</w:t>
+        <w:t xml:space="preserve"> — strong radio energy used to drive the beam,</w:t>
       </w:r>
     </w:p>
     <w:p>
@@ -102,7 +102,7 @@
         <w:t>Oxygen depletion / asphyxiation</w:t>
       </w:r>
       <w:r>
-        <w:t xml:space="preserve"> (cryogenic gases such as liquid nitrogen).</w:t>
+        <w:t xml:space="preserve"> — cold gases such as liquid nitrogen can push the air out and leave nothing to breathe.</w:t>
       </w:r>
     </w:p>
     <w:p>
@@ -116,7 +116,7 @@
         <w:t>Personnel Safety System (PSS)</w:t>
       </w:r>
       <w:r>
-        <w:t xml:space="preserve"> is an independent safety PLC whose entire purpose is one idea:</w:t>
+        <w:t xml:space="preserve"> is an independent safety PLC (a rugged industrial computer that does one job and is kept separate from the normal control system). Its whole purpose is one idea:</w:t>
       </w:r>
     </w:p>
     <w:p>
@@ -147,32 +147,25 @@
         <w:t>Before</w:t>
       </w:r>
       <w:r>
-        <w:t xml:space="preserve"> the hazard is turned on, a person must physically **walk through and</w:t>
-      </w:r>
-    </w:p>
-    <w:p>
-      <w:r>
-        <w:t xml:space="preserve">   "search" the hutch</w:t>
+        <w:t xml:space="preserve"> the hazard is turned on, a person must physically </w:t>
       </w:r>
       <w:r>
         <w:rPr>
           <w:b/>
         </w:rPr>
-        <w:t xml:space="preserve"> to prove nobody is inside, then lock the doors. This is    the </w:t>
+        <w:t>walk through and "search" the hutch</w:t>
       </w:r>
       <w:r>
-        <w:t xml:space="preserve">search sequence** (see </w:t>
+        <w:t xml:space="preserve"> to prove nobody is inside, then lock the doors. This is the </w:t>
       </w:r>
       <w:r>
         <w:rPr>
-          <w:rFonts w:ascii="Consolas" w:hAnsi="Consolas"/>
-          <w:color w:val="C7254E"/>
-          <w:sz w:val="19"/>
+          <w:b/>
         </w:rPr>
-        <w:t>02_SEARCH_SEQUENCE.md</w:t>
+        <w:t>search sequence</w:t>
       </w:r>
       <w:r>
-        <w:t>).</w:t>
+        <w:t xml:space="preserve"> (see document 02, The hutch search).</w:t>
       </w:r>
     </w:p>
     <w:p>
@@ -186,12 +179,7 @@
         <w:t>While</w:t>
       </w:r>
       <w:r>
-        <w:t xml:space="preserve"> the hazard is on, if *anything* unsafe happens (a door opens, a</w:t>
-      </w:r>
-    </w:p>
-    <w:p>
-      <w:r>
-        <w:t xml:space="preserve">   beam-off button is pressed, radiation is detected outside limits, oxygen    drops), the system </w:t>
+        <w:t xml:space="preserve"> the hazard is on, if *anything* unsafe happens (a door opens, a beam-off button is pressed, radiation is detected outside limits, oxygen drops), the system </w:t>
       </w:r>
       <w:r>
         <w:rPr>
@@ -200,7 +188,7 @@
         <w:t>removes the hazard within milliseconds</w:t>
       </w:r>
       <w:r>
-        <w:t xml:space="preserve"> by de-energising    power contactors.</w:t>
+        <w:t xml:space="preserve"> by cutting power to the power contactors (the big switches that feed the hazard).</w:t>
       </w:r>
     </w:p>
     <w:p>
@@ -214,7 +202,7 @@
         <w:t>SIL 2</w:t>
       </w:r>
       <w:r>
-        <w:t xml:space="preserve"> (Safety Integrity Level 2 — a measure of how trustworthy the protection must be, from IEC 61508/61511).</w:t>
+        <w:t xml:space="preserve"> (Safety Integrity Level 2 — a grade, from the IEC 61508/61511 standards, that says how trustworthy the protection must be; higher numbers mean more trustworthy).</w:t>
       </w:r>
     </w:p>
     <w:p>
@@ -249,12 +237,7 @@
         <w:t>Causes</w:t>
       </w:r>
       <w:r>
-        <w:t xml:space="preserve"> — the *inputs*: sensors, buttons, switches. A cause is either</w:t>
-      </w:r>
-    </w:p>
-    <w:p>
-      <w:r>
-        <w:t xml:space="preserve">  </w:t>
+        <w:t xml:space="preserve"> — the *inputs*: sensors, buttons and switches. A cause is either </w:t>
       </w:r>
       <w:r>
         <w:rPr>
@@ -272,7 +255,7 @@
         <w:t>in demand</w:t>
       </w:r>
       <w:r>
-        <w:t xml:space="preserve"> (asking for protection). Examples: a door-closed   switch (demand = door open), a beam-off button (demand = pressed), an oxygen   monitor (demand = O₂ low).</w:t>
+        <w:t xml:space="preserve"> (asking for protection). Examples: a door-closed switch (demand = door open), a beam-off button (demand = pressed), an oxygen monitor (demand = oxygen low).</w:t>
       </w:r>
     </w:p>
     <w:p>
@@ -286,12 +269,7 @@
         <w:t>Effects</w:t>
       </w:r>
       <w:r>
-        <w:t xml:space="preserve"> — the *outputs*: the things the PLC switches. Examples: a power</w:t>
-      </w:r>
-    </w:p>
-    <w:p>
-      <w:r>
-        <w:t xml:space="preserve">  contactor (a big relay that feeds the hazard), a door-lock solenoid, a lamp, a   siren.</w:t>
+        <w:t xml:space="preserve"> — the *outputs*: the things the PLC switches. Examples: a power contactor (a big relay that feeds the hazard), a door-lock solenoid (the electric bolt that locks a door), a lamp, a siren.</w:t>
       </w:r>
     </w:p>
     <w:p>
@@ -305,7 +283,7 @@
         <w:t>Cause &amp; Effect (C&amp;E) matrix</w:t>
       </w:r>
       <w:r>
-        <w:t xml:space="preserve"> is simply a big grid: causes down the side, effects across the top, and a mark where "this cause makes that effect go to its safe state". This project's C&amp;E follows </w:t>
+        <w:t xml:space="preserve"> is simply a big grid: causes down the side, effects across the top, and a mark where "this cause makes that effect go to its safe state". This project's C&amp;E follows the </w:t>
       </w:r>
       <w:r>
         <w:rPr>
@@ -314,7 +292,7 @@
         <w:t>BS EN IEC 62881</w:t>
       </w:r>
       <w:r>
-        <w:t>.</w:t>
+        <w:t xml:space="preserve"> standard.</w:t>
       </w:r>
     </w:p>
     <w:p>
@@ -336,7 +314,7 @@
         <w:t>de-energise to trip</w:t>
       </w:r>
       <w:r>
-        <w:t>. That means:</w:t>
+        <w:t xml:space="preserve"> (the safe state is OFF — when power is removed, the device springs to safe by itself). That means:</w:t>
       </w:r>
     </w:p>
     <w:p>
@@ -356,7 +334,7 @@
     </w:p>
     <w:p>
       <w:r>
-        <w:t xml:space="preserve">So if a wire breaks or the PLC loses power, everything falls to the safe state. In the simulator, an output shown as </w:t>
+        <w:t xml:space="preserve">So if a wire breaks or the PLC loses power, everything falls to the safe state. When you watch an output in testing, an output shown as </w:t>
       </w:r>
       <w:r>
         <w:rPr>
@@ -364,7 +342,7 @@
           <w:color w:val="C7254E"/>
           <w:sz w:val="19"/>
         </w:rPr>
-        <w:t>ON</w:t>
+        <w:t>1</w:t>
       </w:r>
       <w:r>
         <w:t xml:space="preserve">/energised means *the hazard is enabled* or *the door is locked*; </w:t>
@@ -375,10 +353,10 @@
           <w:color w:val="C7254E"/>
           <w:sz w:val="19"/>
         </w:rPr>
-        <w:t>off</w:t>
+        <w:t>0</w:t>
       </w:r>
       <w:r>
-        <w:t xml:space="preserve"> means *safe*.</w:t>
+        <w:t>/off means *safe*.</w:t>
       </w:r>
     </w:p>
     <w:p>
@@ -408,7 +386,7 @@
         <w:t>one faulty sensor cannot</w:t>
       </w:r>
       <w:r>
-        <w:t xml:space="preserve"> (a) cause a dangerous failure, nor (b) cause a nuisance trip. The notation is </w:t>
+        <w:t xml:space="preserve"> (a) cause a dangerous failure, nor (b) cause a nuisance trip (an unnecessary shutdown). The notation is </w:t>
       </w:r>
       <w:r>
         <w:rPr>
@@ -527,7 +505,29 @@
           </w:tcPr>
           <w:p>
             <w:r>
-              <w:t>doors (GADC/SADC), current &amp; voltage transmitters</w:t>
+              <w:t>doors (</w:t>
+            </w:r>
+            <w:r>
+              <w:rPr>
+                <w:rFonts w:ascii="Consolas" w:hAnsi="Consolas"/>
+                <w:color w:val="C7254E"/>
+                <w:sz w:val="19"/>
+              </w:rPr>
+              <w:t>GADC</w:t>
+            </w:r>
+            <w:r>
+              <w:t>/</w:t>
+            </w:r>
+            <w:r>
+              <w:rPr>
+                <w:rFonts w:ascii="Consolas" w:hAnsi="Consolas"/>
+                <w:color w:val="C7254E"/>
+                <w:sz w:val="19"/>
+              </w:rPr>
+              <w:t>SADC</w:t>
+            </w:r>
+            <w:r>
+              <w:t>, the door-closed switches), current and voltage transmitters</w:t>
             </w:r>
           </w:p>
         </w:tc>
@@ -552,7 +552,7 @@
           </w:tcPr>
           <w:p>
             <w:r>
-              <w:t>1 of 2 trips</w:t>
+              <w:t>any 1 of 2 trips</w:t>
             </w:r>
           </w:p>
         </w:tc>
@@ -562,7 +562,18 @@
           </w:tcPr>
           <w:p>
             <w:r>
-              <w:t>service door pair, radiation monitors</w:t>
+              <w:t>second service-door switch pair, radiation monitors (</w:t>
+            </w:r>
+            <w:r>
+              <w:rPr>
+                <w:rFonts w:ascii="Consolas" w:hAnsi="Consolas"/>
+                <w:color w:val="C7254E"/>
+                <w:sz w:val="19"/>
+              </w:rPr>
+              <w:t>RDMN</w:t>
+            </w:r>
+            <w:r>
+              <w:t>)</w:t>
             </w:r>
           </w:p>
         </w:tc>
@@ -597,7 +608,18 @@
           </w:tcPr>
           <w:p>
             <w:r>
-              <w:t>oxygen monitors</w:t>
+              <w:t>oxygen monitors (</w:t>
+            </w:r>
+            <w:r>
+              <w:rPr>
+                <w:rFonts w:ascii="Consolas" w:hAnsi="Consolas"/>
+                <w:color w:val="C7254E"/>
+                <w:sz w:val="19"/>
+              </w:rPr>
+              <w:t>OXMON</w:t>
+            </w:r>
+            <w:r>
+              <w:t>)</w:t>
             </w:r>
           </w:p>
         </w:tc>
@@ -612,7 +634,7 @@
               <w:rPr>
                 <w:b/>
               </w:rPr>
-              <w:t>1oo7/1oo8</w:t>
+              <w:t>1oo7</w:t>
             </w:r>
           </w:p>
         </w:tc>
@@ -622,7 +644,7 @@
           </w:tcPr>
           <w:p>
             <w:r>
-              <w:t>any 1 button trips</w:t>
+              <w:t>any 1 of the beam-off buttons trips</w:t>
             </w:r>
           </w:p>
         </w:tc>
@@ -632,7 +654,18 @@
           </w:tcPr>
           <w:p>
             <w:r>
-              <w:t>beam-off buttons</w:t>
+              <w:t>beam-off buttons (</w:t>
+            </w:r>
+            <w:r>
+              <w:rPr>
+                <w:rFonts w:ascii="Consolas" w:hAnsi="Consolas"/>
+                <w:color w:val="C7254E"/>
+                <w:sz w:val="19"/>
+              </w:rPr>
+              <w:t>BOB</w:t>
+            </w:r>
+            <w:r>
+              <w:t>)</w:t>
             </w:r>
           </w:p>
         </w:tc>
@@ -667,7 +700,18 @@
           </w:tcPr>
           <w:p>
             <w:r>
-              <w:t>enable keys</w:t>
+              <w:t>enable keys (</w:t>
+            </w:r>
+            <w:r>
+              <w:rPr>
+                <w:rFonts w:ascii="Consolas" w:hAnsi="Consolas"/>
+                <w:color w:val="C7254E"/>
+                <w:sz w:val="19"/>
+              </w:rPr>
+              <w:t>KEY</w:t>
+            </w:r>
+            <w:r>
+              <w:t>)</w:t>
             </w:r>
           </w:p>
         </w:tc>
@@ -676,7 +720,7 @@
     <w:p/>
     <w:p>
       <w:r>
-        <w:t xml:space="preserve">The simulator implements all of these in one tiny function — see </w:t>
+        <w:t xml:space="preserve">Worked example: the radiation-present check uses the current transmitters </w:t>
       </w:r>
       <w:r>
         <w:rPr>
@@ -684,43 +728,19 @@
           <w:color w:val="C7254E"/>
           <w:sz w:val="19"/>
         </w:rPr>
-        <w:t>vote()</w:t>
+        <w:t>BL10E-PS-IT-01..03</w:t>
       </w:r>
       <w:r>
-        <w:t xml:space="preserve"> in </w:t>
+        <w:t xml:space="preserve"> (the sensors that show the electron source is electrically live) voted </w:t>
       </w:r>
       <w:r>
         <w:rPr>
-          <w:rFonts w:ascii="Consolas" w:hAnsi="Consolas"/>
-          <w:color w:val="C7254E"/>
-          <w:sz w:val="19"/>
+          <w:b/>
         </w:rPr>
-        <w:t>pss_sim.py</w:t>
+        <w:t>2oo3</w:t>
       </w:r>
       <w:r>
-        <w:t xml:space="preserve">. Try it: in the CLI, </w:t>
-      </w:r>
-      <w:r>
-        <w:rPr>
-          <w:rFonts w:ascii="Consolas" w:hAnsi="Consolas"/>
-          <w:color w:val="C7254E"/>
-          <w:sz w:val="19"/>
-        </w:rPr>
-        <w:t>ai IT01 12</w:t>
-      </w:r>
-      <w:r>
-        <w:t xml:space="preserve"> then </w:t>
-      </w:r>
-      <w:r>
-        <w:rPr>
-          <w:rFonts w:ascii="Consolas" w:hAnsi="Consolas"/>
-          <w:color w:val="C7254E"/>
-          <w:sz w:val="19"/>
-        </w:rPr>
-        <w:t>ai IT02 12</w:t>
-      </w:r>
-      <w:r>
-        <w:t xml:space="preserve"> — one transmitter high does nothing, the second one (2 of 3) declares "radiation present".</w:t>
+        <w:t>. If only one transmitter reads high, nothing happens. When a second one also reads high, that is 2 of 3, so the PLC declares "source live / radiation present". To see how to drive these signals yourself, follow document 04 (the SILworX offline test procedure).</w:t>
       </w:r>
     </w:p>
     <w:p>
@@ -741,7 +761,7 @@
     </w:p>
     <w:p>
       <w:r>
-        <w:t>Grouped the way the C&amp;E groups them (the letter is the C&amp;E "Group" column):</w:t>
+        <w:t>Grouped the way the C&amp;E groups them (the letter is the C&amp;E "Group" column). Each tag has a short plain-language meaning next to it.</w:t>
       </w:r>
     </w:p>
     <w:tbl>
@@ -852,7 +872,21 @@
           </w:tcPr>
           <w:p>
             <w:r>
-              <w:t>GADC01-03</w:t>
+              <w:rPr>
+                <w:rFonts w:ascii="Consolas" w:hAnsi="Consolas"/>
+                <w:color w:val="C7254E"/>
+                <w:sz w:val="19"/>
+              </w:rPr>
+              <w:t>GADC-01..03</w:t>
+            </w:r>
+            <w:r>
+              <w:t xml:space="preserve"> — three closed-switches on the </w:t>
+            </w:r>
+            <w:r>
+              <w:rPr>
+                <w:b/>
+              </w:rPr>
+              <w:t>main personnel door</w:t>
             </w:r>
           </w:p>
         </w:tc>
@@ -862,16 +896,16 @@
           </w:tcPr>
           <w:p>
             <w:r>
-              <w:t xml:space="preserve">General Access </w:t>
+              <w:t xml:space="preserve">main personnel </w:t>
             </w:r>
             <w:r>
               <w:rPr>
                 <w:b/>
               </w:rPr>
-              <w:t>Door</w:t>
-            </w:r>
-            <w:r>
-              <w:t xml:space="preserve"> closed</w:t>
+              <w:t>door</w:t>
+            </w:r>
+            <w:r>
+              <w:t xml:space="preserve"> is shut</w:t>
             </w:r>
           </w:p>
         </w:tc>
@@ -913,7 +947,21 @@
           </w:tcPr>
           <w:p>
             <w:r>
-              <w:t>GADC04-06</w:t>
+              <w:rPr>
+                <w:rFonts w:ascii="Consolas" w:hAnsi="Consolas"/>
+                <w:color w:val="C7254E"/>
+                <w:sz w:val="19"/>
+              </w:rPr>
+              <w:t>GADC-04..06</w:t>
+            </w:r>
+            <w:r>
+              <w:t xml:space="preserve"> — three closed-switches on the </w:t>
+            </w:r>
+            <w:r>
+              <w:rPr>
+                <w:b/>
+              </w:rPr>
+              <w:t>entrance gate</w:t>
             </w:r>
           </w:p>
         </w:tc>
@@ -923,16 +971,16 @@
           </w:tcPr>
           <w:p>
             <w:r>
-              <w:t xml:space="preserve">General Access </w:t>
+              <w:t xml:space="preserve">entrance </w:t>
             </w:r>
             <w:r>
               <w:rPr>
                 <w:b/>
               </w:rPr>
-              <w:t>Gate</w:t>
-            </w:r>
-            <w:r>
-              <w:t xml:space="preserve"> closed</w:t>
+              <w:t>gate</w:t>
+            </w:r>
+            <w:r>
+              <w:t xml:space="preserve"> is shut</w:t>
             </w:r>
           </w:p>
         </w:tc>
@@ -974,7 +1022,21 @@
           </w:tcPr>
           <w:p>
             <w:r>
-              <w:t>SADC01-03</w:t>
+              <w:rPr>
+                <w:rFonts w:ascii="Consolas" w:hAnsi="Consolas"/>
+                <w:color w:val="C7254E"/>
+                <w:sz w:val="19"/>
+              </w:rPr>
+              <w:t>SADC-01..03</w:t>
+            </w:r>
+            <w:r>
+              <w:t xml:space="preserve"> — closed-switches on the </w:t>
+            </w:r>
+            <w:r>
+              <w:rPr>
+                <w:b/>
+              </w:rPr>
+              <w:t>service / maintenance door</w:t>
             </w:r>
           </w:p>
         </w:tc>
@@ -984,7 +1046,16 @@
           </w:tcPr>
           <w:p>
             <w:r>
-              <w:t>Service Access Door closed</w:t>
+              <w:t xml:space="preserve">service </w:t>
+            </w:r>
+            <w:r>
+              <w:rPr>
+                <w:b/>
+              </w:rPr>
+              <w:t>door</w:t>
+            </w:r>
+            <w:r>
+              <w:t xml:space="preserve"> is shut</w:t>
             </w:r>
           </w:p>
         </w:tc>
@@ -1026,7 +1097,21 @@
           </w:tcPr>
           <w:p>
             <w:r>
-              <w:t>SADC04-05</w:t>
+              <w:rPr>
+                <w:rFonts w:ascii="Consolas" w:hAnsi="Consolas"/>
+                <w:color w:val="C7254E"/>
+                <w:sz w:val="19"/>
+              </w:rPr>
+              <w:t>SADC-04..05</w:t>
+            </w:r>
+            <w:r>
+              <w:t xml:space="preserve"> — a second set of closed-switches on the </w:t>
+            </w:r>
+            <w:r>
+              <w:rPr>
+                <w:b/>
+              </w:rPr>
+              <w:t>service door</w:t>
             </w:r>
           </w:p>
         </w:tc>
@@ -1036,7 +1121,7 @@
           </w:tcPr>
           <w:p>
             <w:r>
-              <w:t>Service Access Door closed (2nd)</w:t>
+              <w:t>service door is shut (2nd set)</w:t>
             </w:r>
           </w:p>
         </w:tc>
@@ -1078,7 +1163,24 @@
           </w:tcPr>
           <w:p>
             <w:r>
-              <w:t>IT01-03</w:t>
+              <w:rPr>
+                <w:rFonts w:ascii="Consolas" w:hAnsi="Consolas"/>
+                <w:color w:val="C7254E"/>
+                <w:sz w:val="19"/>
+              </w:rPr>
+              <w:t>IT-01..03</w:t>
+            </w:r>
+            <w:r>
+              <w:t xml:space="preserve"> — </w:t>
+            </w:r>
+            <w:r>
+              <w:rPr>
+                <w:b/>
+              </w:rPr>
+              <w:t>current transmitters</w:t>
+            </w:r>
+            <w:r>
+              <w:t xml:space="preserve"> on the electron source</w:t>
             </w:r>
           </w:p>
         </w:tc>
@@ -1088,7 +1190,7 @@
           </w:tcPr>
           <w:p>
             <w:r>
-              <w:t xml:space="preserve">Electron-source </w:t>
+              <w:t xml:space="preserve">electron-source </w:t>
             </w:r>
             <w:r>
               <w:rPr>
@@ -1097,7 +1199,7 @@
               <w:t>current</w:t>
             </w:r>
             <w:r>
-              <w:t xml:space="preserve"> present</w:t>
+              <w:t xml:space="preserve"> present (source live)</w:t>
             </w:r>
           </w:p>
         </w:tc>
@@ -1139,7 +1241,24 @@
           </w:tcPr>
           <w:p>
             <w:r>
-              <w:t>VT01-03</w:t>
+              <w:rPr>
+                <w:rFonts w:ascii="Consolas" w:hAnsi="Consolas"/>
+                <w:color w:val="C7254E"/>
+                <w:sz w:val="19"/>
+              </w:rPr>
+              <w:t>VT-01..03</w:t>
+            </w:r>
+            <w:r>
+              <w:t xml:space="preserve"> — </w:t>
+            </w:r>
+            <w:r>
+              <w:rPr>
+                <w:b/>
+              </w:rPr>
+              <w:t>voltage transmitters</w:t>
+            </w:r>
+            <w:r>
+              <w:t xml:space="preserve"> on the electron source</w:t>
             </w:r>
           </w:p>
         </w:tc>
@@ -1149,7 +1268,7 @@
           </w:tcPr>
           <w:p>
             <w:r>
-              <w:t xml:space="preserve">Electron-source </w:t>
+              <w:t xml:space="preserve">electron-source </w:t>
             </w:r>
             <w:r>
               <w:rPr>
@@ -1158,7 +1277,7 @@
               <w:t>voltage</w:t>
             </w:r>
             <w:r>
-              <w:t xml:space="preserve"> present</w:t>
+              <w:t xml:space="preserve"> present (source live)</w:t>
             </w:r>
           </w:p>
         </w:tc>
@@ -1200,7 +1319,24 @@
           </w:tcPr>
           <w:p>
             <w:r>
-              <w:t>OXMON01-04</w:t>
+              <w:rPr>
+                <w:rFonts w:ascii="Consolas" w:hAnsi="Consolas"/>
+                <w:color w:val="C7254E"/>
+                <w:sz w:val="19"/>
+              </w:rPr>
+              <w:t>OXMON-01..04</w:t>
+            </w:r>
+            <w:r>
+              <w:t xml:space="preserve"> — </w:t>
+            </w:r>
+            <w:r>
+              <w:rPr>
+                <w:b/>
+              </w:rPr>
+              <w:t>oxygen monitors</w:t>
+            </w:r>
+            <w:r>
+              <w:t xml:space="preserve"> in the hutch</w:t>
             </w:r>
           </w:p>
         </w:tc>
@@ -1213,10 +1349,10 @@
               <w:rPr>
                 <w:b/>
               </w:rPr>
-              <w:t>Oxygen</w:t>
-            </w:r>
-            <w:r>
-              <w:t xml:space="preserve"> depletion</w:t>
+              <w:t>oxygen</w:t>
+            </w:r>
+            <w:r>
+              <w:t xml:space="preserve"> has dropped (air unsafe)</w:t>
             </w:r>
           </w:p>
         </w:tc>
@@ -1258,7 +1394,24 @@
           </w:tcPr>
           <w:p>
             <w:r>
-              <w:t>BOB01-08</w:t>
+              <w:rPr>
+                <w:rFonts w:ascii="Consolas" w:hAnsi="Consolas"/>
+                <w:color w:val="C7254E"/>
+                <w:sz w:val="19"/>
+              </w:rPr>
+              <w:t>BOB-01..08</w:t>
+            </w:r>
+            <w:r>
+              <w:t xml:space="preserve"> — the eight </w:t>
+            </w:r>
+            <w:r>
+              <w:rPr>
+                <w:b/>
+              </w:rPr>
+              <w:t>beam-off buttons</w:t>
+            </w:r>
+            <w:r>
+              <w:t xml:space="preserve"> (emergency stop, two wires each)</w:t>
             </w:r>
           </w:p>
         </w:tc>
@@ -1268,13 +1421,13 @@
           </w:tcPr>
           <w:p>
             <w:r>
+              <w:t xml:space="preserve">a beam-off button is </w:t>
+            </w:r>
+            <w:r>
               <w:rPr>
                 <w:b/>
               </w:rPr>
-              <w:t>Beam-Off Buttons</w:t>
-            </w:r>
-            <w:r>
-              <w:t xml:space="preserve"> (dual-channel)</w:t>
+              <w:t>pressed</w:t>
             </w:r>
           </w:p>
         </w:tc>
@@ -1316,7 +1469,24 @@
           </w:tcPr>
           <w:p>
             <w:r>
-              <w:t>RDMN01-02</w:t>
+              <w:rPr>
+                <w:rFonts w:ascii="Consolas" w:hAnsi="Consolas"/>
+                <w:color w:val="C7254E"/>
+                <w:sz w:val="19"/>
+              </w:rPr>
+              <w:t>RDMN-01..02</w:t>
+            </w:r>
+            <w:r>
+              <w:t xml:space="preserve"> — </w:t>
+            </w:r>
+            <w:r>
+              <w:rPr>
+                <w:b/>
+              </w:rPr>
+              <w:t>radiation monitors</w:t>
+            </w:r>
+            <w:r>
+              <w:t xml:space="preserve"> (dose and rate)</w:t>
             </w:r>
           </w:p>
         </w:tc>
@@ -1329,10 +1499,10 @@
               <w:rPr>
                 <w:b/>
               </w:rPr>
-              <w:t>Radiation</w:t>
-            </w:r>
-            <w:r>
-              <w:t xml:space="preserve"> monitors (dose + rate)</w:t>
+              <w:t>radiation</w:t>
+            </w:r>
+            <w:r>
+              <w:t xml:space="preserve"> is high</w:t>
             </w:r>
           </w:p>
         </w:tc>
@@ -1374,7 +1544,24 @@
           </w:tcPr>
           <w:p>
             <w:r>
-              <w:t>KEY01/02/03</w:t>
+              <w:rPr>
+                <w:rFonts w:ascii="Consolas" w:hAnsi="Consolas"/>
+                <w:color w:val="C7254E"/>
+                <w:sz w:val="19"/>
+              </w:rPr>
+              <w:t>KEY-01/02/03</w:t>
+            </w:r>
+            <w:r>
+              <w:t xml:space="preserve"> — </w:t>
+            </w:r>
+            <w:r>
+              <w:rPr>
+                <w:b/>
+              </w:rPr>
+              <w:t>enable key switches</w:t>
+            </w:r>
+            <w:r>
+              <w:t xml:space="preserve"> (turned by hand)</w:t>
             </w:r>
           </w:p>
         </w:tc>
@@ -1384,13 +1571,13 @@
           </w:tcPr>
           <w:p>
             <w:r>
-              <w:t xml:space="preserve">Enable </w:t>
+              <w:t xml:space="preserve">an enable key is </w:t>
             </w:r>
             <w:r>
               <w:rPr>
                 <w:b/>
               </w:rPr>
-              <w:t>key switches</w:t>
+              <w:t>turned on</w:t>
             </w:r>
           </w:p>
         </w:tc>
@@ -1432,7 +1619,84 @@
           </w:tcPr>
           <w:p>
             <w:r>
-              <w:t>SCR, LCRx, ASB01-04, ASBF</w:t>
+              <w:rPr>
+                <w:rFonts w:ascii="Consolas" w:hAnsi="Consolas"/>
+                <w:color w:val="C7254E"/>
+                <w:sz w:val="19"/>
+              </w:rPr>
+              <w:t>SCR</w:t>
+            </w:r>
+            <w:r>
+              <w:t xml:space="preserve"> (</w:t>
+            </w:r>
+            <w:r>
+              <w:rPr>
+                <w:b/>
+              </w:rPr>
+              <w:t>search card reader</w:t>
+            </w:r>
+            <w:r>
+              <w:t xml:space="preserve">), </w:t>
+            </w:r>
+            <w:r>
+              <w:rPr>
+                <w:rFonts w:ascii="Consolas" w:hAnsi="Consolas"/>
+                <w:color w:val="C7254E"/>
+                <w:sz w:val="19"/>
+              </w:rPr>
+              <w:t>LCRx</w:t>
+            </w:r>
+            <w:r>
+              <w:t xml:space="preserve"> (</w:t>
+            </w:r>
+            <w:r>
+              <w:rPr>
+                <w:b/>
+              </w:rPr>
+              <w:t>light curtain</w:t>
+            </w:r>
+            <w:r>
+              <w:t xml:space="preserve"> across the doorway), </w:t>
+            </w:r>
+            <w:r>
+              <w:rPr>
+                <w:rFonts w:ascii="Consolas" w:hAnsi="Consolas"/>
+                <w:color w:val="C7254E"/>
+                <w:sz w:val="19"/>
+              </w:rPr>
+              <w:t>ASB-01..04</w:t>
+            </w:r>
+            <w:r>
+              <w:t xml:space="preserve"> (</w:t>
+            </w:r>
+            <w:r>
+              <w:rPr>
+                <w:b/>
+              </w:rPr>
+              <w:t>area-search buttons</w:t>
+            </w:r>
+            <w:r>
+              <w:t xml:space="preserve"> pressed in order), </w:t>
+            </w:r>
+            <w:r>
+              <w:rPr>
+                <w:rFonts w:ascii="Consolas" w:hAnsi="Consolas"/>
+                <w:color w:val="C7254E"/>
+                <w:sz w:val="19"/>
+              </w:rPr>
+              <w:t>ASBF-01</w:t>
+            </w:r>
+            <w:r>
+              <w:t xml:space="preserve"> (the </w:t>
+            </w:r>
+            <w:r>
+              <w:rPr>
+                <w:b/>
+              </w:rPr>
+              <w:t>final</w:t>
+            </w:r>
+            <w:r>
+              <w:t xml:space="preserve"> area-search button by the exit)</w:t>
             </w:r>
           </w:p>
         </w:tc>
@@ -1442,7 +1706,7 @@
           </w:tcPr>
           <w:p>
             <w:r>
-              <w:t>Search devices (card, light-curtain, buttons)</w:t>
+              <w:t>the steps of walking through and searching the hutch</w:t>
             </w:r>
           </w:p>
         </w:tc>
@@ -1543,7 +1807,30 @@
           </w:tcPr>
           <w:p>
             <w:r>
-              <w:t>CON01-05</w:t>
+              <w:rPr>
+                <w:rFonts w:ascii="Consolas" w:hAnsi="Consolas"/>
+                <w:color w:val="C7254E"/>
+                <w:sz w:val="19"/>
+              </w:rPr>
+              <w:t>CON-01..05</w:t>
+            </w:r>
+            <w:r>
+              <w:t xml:space="preserve"> — </w:t>
+            </w:r>
+            <w:r>
+              <w:rPr>
+                <w:b/>
+              </w:rPr>
+              <w:t>power contactors</w:t>
+            </w:r>
+            <w:r>
+              <w:t xml:space="preserve"> feeding the </w:t>
+            </w:r>
+            <w:r>
+              <w:rPr>
+                <w:b/>
+              </w:rPr>
+              <w:t>electron source</w:t>
             </w:r>
           </w:p>
         </w:tc>
@@ -1553,7 +1840,7 @@
           </w:tcPr>
           <w:p>
             <w:r>
-              <w:t>Electron-source power contactors</w:t>
+              <w:t>the big switches that power the electron source</w:t>
             </w:r>
           </w:p>
         </w:tc>
@@ -1563,7 +1850,7 @@
           </w:tcPr>
           <w:p>
             <w:r>
-              <w:t>open (isolated)</w:t>
+              <w:t>open (source isolated)</w:t>
             </w:r>
           </w:p>
         </w:tc>
@@ -1575,7 +1862,33 @@
           </w:tcPr>
           <w:p>
             <w:r>
-              <w:t>CON06-08</w:t>
+              <w:rPr>
+                <w:rFonts w:ascii="Consolas" w:hAnsi="Consolas"/>
+                <w:color w:val="C7254E"/>
+                <w:sz w:val="19"/>
+              </w:rPr>
+              <w:t>CON-06..08</w:t>
+            </w:r>
+            <w:r>
+              <w:t xml:space="preserve"> — </w:t>
+            </w:r>
+            <w:r>
+              <w:rPr>
+                <w:b/>
+              </w:rPr>
+              <w:t>power contactors</w:t>
+            </w:r>
+            <w:r>
+              <w:t xml:space="preserve"> for the </w:t>
+            </w:r>
+            <w:r>
+              <w:rPr>
+                <w:b/>
+              </w:rPr>
+              <w:t>3-phase RF</w:t>
+            </w:r>
+            <w:r>
+              <w:t xml:space="preserve"> supply</w:t>
             </w:r>
           </w:p>
         </w:tc>
@@ -1585,7 +1898,7 @@
           </w:tcPr>
           <w:p>
             <w:r>
-              <w:t>3-phase RF power contactors</w:t>
+              <w:t>the big switches that power the RF</w:t>
             </w:r>
           </w:p>
         </w:tc>
@@ -1607,7 +1920,30 @@
           </w:tcPr>
           <w:p>
             <w:r>
-              <w:t>CON09-10</w:t>
+              <w:rPr>
+                <w:rFonts w:ascii="Consolas" w:hAnsi="Consolas"/>
+                <w:color w:val="C7254E"/>
+                <w:sz w:val="19"/>
+              </w:rPr>
+              <w:t>CON-09..10</w:t>
+            </w:r>
+            <w:r>
+              <w:t xml:space="preserve"> — </w:t>
+            </w:r>
+            <w:r>
+              <w:rPr>
+                <w:b/>
+              </w:rPr>
+              <w:t>power contactors</w:t>
+            </w:r>
+            <w:r>
+              <w:t xml:space="preserve"> for the </w:t>
+            </w:r>
+            <w:r>
+              <w:rPr>
+                <w:b/>
+              </w:rPr>
+              <w:t>1-phase RF drive</w:t>
             </w:r>
           </w:p>
         </w:tc>
@@ -1617,7 +1953,7 @@
           </w:tcPr>
           <w:p>
             <w:r>
-              <w:t>1-phase RF drive contactors</w:t>
+              <w:t>the switches that power the RF drive</w:t>
             </w:r>
           </w:p>
         </w:tc>
@@ -1639,7 +1975,43 @@
           </w:tcPr>
           <w:p>
             <w:r>
-              <w:t>GADL01-04, SADL01-02 (SOL-01..06)</w:t>
+              <w:rPr>
+                <w:rFonts w:ascii="Consolas" w:hAnsi="Consolas"/>
+                <w:color w:val="C7254E"/>
+                <w:sz w:val="19"/>
+              </w:rPr>
+              <w:t>GADL-01..04</w:t>
+            </w:r>
+            <w:r>
+              <w:t xml:space="preserve">, </w:t>
+            </w:r>
+            <w:r>
+              <w:rPr>
+                <w:rFonts w:ascii="Consolas" w:hAnsi="Consolas"/>
+                <w:color w:val="C7254E"/>
+                <w:sz w:val="19"/>
+              </w:rPr>
+              <w:t>SADL-01..02</w:t>
+            </w:r>
+            <w:r>
+              <w:t xml:space="preserve"> (the solenoids </w:t>
+            </w:r>
+            <w:r>
+              <w:rPr>
+                <w:rFonts w:ascii="Consolas" w:hAnsi="Consolas"/>
+                <w:color w:val="C7254E"/>
+                <w:sz w:val="19"/>
+              </w:rPr>
+              <w:t>SOL-01..06</w:t>
+            </w:r>
+            <w:r>
+              <w:t xml:space="preserve">) — door/gate </w:t>
+            </w:r>
+            <w:r>
+              <w:rPr>
+                <w:b/>
+              </w:rPr>
+              <w:t>lock solenoids</w:t>
             </w:r>
           </w:p>
         </w:tc>
@@ -1649,16 +2021,7 @@
           </w:tcPr>
           <w:p>
             <w:r>
-              <w:t xml:space="preserve">Door/gate </w:t>
-            </w:r>
-            <w:r>
-              <w:rPr>
-                <w:b/>
-              </w:rPr>
-              <w:t>lock</w:t>
-            </w:r>
-            <w:r>
-              <w:t xml:space="preserve"> solenoids</w:t>
+              <w:t>the electric bolts that lock the doors and gate</w:t>
             </w:r>
           </w:p>
         </w:tc>
@@ -1680,7 +2043,57 @@
           </w:tcPr>
           <w:p>
             <w:r>
-              <w:t>ANNOPN/ANNRES/ANNSTD/ANNBON</w:t>
+              <w:rPr>
+                <w:rFonts w:ascii="Consolas" w:hAnsi="Consolas"/>
+                <w:color w:val="C7254E"/>
+                <w:sz w:val="19"/>
+              </w:rPr>
+              <w:t>ANNOPN</w:t>
+            </w:r>
+            <w:r>
+              <w:t xml:space="preserve"> / </w:t>
+            </w:r>
+            <w:r>
+              <w:rPr>
+                <w:rFonts w:ascii="Consolas" w:hAnsi="Consolas"/>
+                <w:color w:val="C7254E"/>
+                <w:sz w:val="19"/>
+              </w:rPr>
+              <w:t>ANNRES</w:t>
+            </w:r>
+            <w:r>
+              <w:t xml:space="preserve"> / </w:t>
+            </w:r>
+            <w:r>
+              <w:rPr>
+                <w:rFonts w:ascii="Consolas" w:hAnsi="Consolas"/>
+                <w:color w:val="C7254E"/>
+                <w:sz w:val="19"/>
+              </w:rPr>
+              <w:t>ANNSTB</w:t>
+            </w:r>
+            <w:r>
+              <w:t xml:space="preserve"> / </w:t>
+            </w:r>
+            <w:r>
+              <w:rPr>
+                <w:rFonts w:ascii="Consolas" w:hAnsi="Consolas"/>
+                <w:color w:val="C7254E"/>
+                <w:sz w:val="19"/>
+              </w:rPr>
+              <w:t>ANNBON</w:t>
+            </w:r>
+            <w:r>
+              <w:t xml:space="preserve"> — hutch status </w:t>
+            </w:r>
+            <w:r>
+              <w:rPr>
+                <w:b/>
+              </w:rPr>
+              <w:t>sign</w:t>
+            </w:r>
+            <w:r>
+              <w:t xml:space="preserve"> (Open / Restricted / Standby / Beam On)</w:t>
             </w:r>
           </w:p>
         </w:tc>
@@ -1690,16 +2103,7 @@
           </w:tcPr>
           <w:p>
             <w:r>
-              <w:t xml:space="preserve">Hutch status </w:t>
-            </w:r>
-            <w:r>
-              <w:rPr>
-                <w:b/>
-              </w:rPr>
-              <w:t>annunciator</w:t>
-            </w:r>
-            <w:r>
-              <w:t xml:space="preserve"> sign</w:t>
+              <w:t>the lit sign telling people the hutch state</w:t>
             </w:r>
           </w:p>
         </w:tc>
@@ -1721,7 +2125,46 @@
           </w:tcPr>
           <w:p>
             <w:r>
-              <w:t>SP01/SP02/SP03</w:t>
+              <w:rPr>
+                <w:rFonts w:ascii="Consolas" w:hAnsi="Consolas"/>
+                <w:color w:val="C7254E"/>
+                <w:sz w:val="19"/>
+              </w:rPr>
+              <w:t>SP01</w:t>
+            </w:r>
+            <w:r>
+              <w:t xml:space="preserve"> / </w:t>
+            </w:r>
+            <w:r>
+              <w:rPr>
+                <w:rFonts w:ascii="Consolas" w:hAnsi="Consolas"/>
+                <w:color w:val="C7254E"/>
+                <w:sz w:val="19"/>
+              </w:rPr>
+              <w:t>SP02</w:t>
+            </w:r>
+            <w:r>
+              <w:t xml:space="preserve"> / </w:t>
+            </w:r>
+            <w:r>
+              <w:rPr>
+                <w:rFonts w:ascii="Consolas" w:hAnsi="Consolas"/>
+                <w:color w:val="C7254E"/>
+                <w:sz w:val="19"/>
+              </w:rPr>
+              <w:t>SP03</w:t>
+            </w:r>
+            <w:r>
+              <w:t xml:space="preserve"> — </w:t>
+            </w:r>
+            <w:r>
+              <w:rPr>
+                <w:b/>
+              </w:rPr>
+              <w:t>beacons and sounders</w:t>
+            </w:r>
+            <w:r>
+              <w:t xml:space="preserve"> (caution / deterrent / alarm)</w:t>
             </w:r>
           </w:p>
         </w:tc>
@@ -1731,7 +2174,7 @@
           </w:tcPr>
           <w:p>
             <w:r>
-              <w:t>Speaker/beacon programs (caution/deterrent/alarm)</w:t>
+              <w:t>warning lights and sirens</w:t>
             </w:r>
           </w:p>
         </w:tc>
@@ -1753,7 +2196,24 @@
           </w:tcPr>
           <w:p>
             <w:r>
-              <w:t>BLUEL01-04 (-06)</w:t>
+              <w:rPr>
+                <w:rFonts w:ascii="Consolas" w:hAnsi="Consolas"/>
+                <w:color w:val="C7254E"/>
+                <w:sz w:val="19"/>
+              </w:rPr>
+              <w:t>BLUEL-01..06</w:t>
+            </w:r>
+            <w:r>
+              <w:t xml:space="preserve"> — </w:t>
+            </w:r>
+            <w:r>
+              <w:rPr>
+                <w:b/>
+              </w:rPr>
+              <w:t>blue warning lights</w:t>
+            </w:r>
+            <w:r>
+              <w:t xml:space="preserve"> (radiation deterrent)</w:t>
             </w:r>
           </w:p>
         </w:tc>
@@ -1763,13 +2223,7 @@
           </w:tcPr>
           <w:p>
             <w:r>
-              <w:rPr>
-                <w:b/>
-              </w:rPr>
-              <w:t>Blue lights</w:t>
-            </w:r>
-            <w:r>
-              <w:t xml:space="preserve"> (radiation deterrent)</w:t>
+              <w:t>blue lights that warn radiation is near</w:t>
             </w:r>
           </w:p>
         </w:tc>
@@ -1791,7 +2245,44 @@
           </w:tcPr>
           <w:p>
             <w:r>
-              <w:t>BONI / BOBI01-04</w:t>
+              <w:rPr>
+                <w:rFonts w:ascii="Consolas" w:hAnsi="Consolas"/>
+                <w:color w:val="C7254E"/>
+                <w:sz w:val="19"/>
+              </w:rPr>
+              <w:t>BONI</w:t>
+            </w:r>
+            <w:r>
+              <w:t xml:space="preserve"> (</w:t>
+            </w:r>
+            <w:r>
+              <w:rPr>
+                <w:b/>
+              </w:rPr>
+              <w:t>"Beam On" indicator</w:t>
+            </w:r>
+            <w:r>
+              <w:t xml:space="preserve">) / </w:t>
+            </w:r>
+            <w:r>
+              <w:rPr>
+                <w:rFonts w:ascii="Consolas" w:hAnsi="Consolas"/>
+                <w:color w:val="C7254E"/>
+                <w:sz w:val="19"/>
+              </w:rPr>
+              <w:t>BOBI-01..04</w:t>
+            </w:r>
+            <w:r>
+              <w:t xml:space="preserve"> (</w:t>
+            </w:r>
+            <w:r>
+              <w:rPr>
+                <w:b/>
+              </w:rPr>
+              <w:t>"Press Beam Off" indicators</w:t>
+            </w:r>
+            <w:r>
+              <w:t>)</w:t>
             </w:r>
           </w:p>
         </w:tc>
@@ -1801,7 +2292,7 @@
           </w:tcPr>
           <w:p>
             <w:r>
-              <w:t>"Beam On" / "Press Beam Off" indicators</w:t>
+              <w:t>lamps showing beam status</w:t>
             </w:r>
           </w:p>
         </w:tc>
@@ -1823,7 +2314,32 @@
           </w:tcPr>
           <w:p>
             <w:r>
+              <w:rPr>
+                <w:rFonts w:ascii="Consolas" w:hAnsi="Consolas"/>
+                <w:color w:val="C7254E"/>
+                <w:sz w:val="19"/>
+              </w:rPr>
               <w:t>SDVLN2</w:t>
+            </w:r>
+            <w:r>
+              <w:t xml:space="preserve"> (valve </w:t>
+            </w:r>
+            <w:r>
+              <w:rPr>
+                <w:rFonts w:ascii="Consolas" w:hAnsi="Consolas"/>
+                <w:color w:val="C7254E"/>
+                <w:sz w:val="19"/>
+              </w:rPr>
+              <w:t>SOVLN2-01</w:t>
+            </w:r>
+            <w:r>
+              <w:t xml:space="preserve">) — </w:t>
+            </w:r>
+            <w:r>
+              <w:rPr>
+                <w:b/>
+              </w:rPr>
+              <w:t>liquid-nitrogen shut-off valve</w:t>
             </w:r>
           </w:p>
         </w:tc>
@@ -1833,7 +2349,7 @@
           </w:tcPr>
           <w:p>
             <w:r>
-              <w:t>Liquid-nitrogen shut-off valve</w:t>
+              <w:t>the valve that lets liquid nitrogen flow</w:t>
             </w:r>
           </w:p>
         </w:tc>
@@ -1855,7 +2371,24 @@
           </w:tcPr>
           <w:p>
             <w:r>
-              <w:t>IND01-03</w:t>
+              <w:rPr>
+                <w:rFonts w:ascii="Consolas" w:hAnsi="Consolas"/>
+                <w:color w:val="C7254E"/>
+                <w:sz w:val="19"/>
+              </w:rPr>
+              <w:t>IND-01..03</w:t>
+            </w:r>
+            <w:r>
+              <w:t xml:space="preserve"> — </w:t>
+            </w:r>
+            <w:r>
+              <w:rPr>
+                <w:b/>
+              </w:rPr>
+              <w:t>oxygen traffic-light indicators</w:t>
+            </w:r>
+            <w:r>
+              <w:t xml:space="preserve"> (green/red)</w:t>
             </w:r>
           </w:p>
         </w:tc>
@@ -1865,7 +2398,7 @@
           </w:tcPr>
           <w:p>
             <w:r>
-              <w:t>O₂ / toxic-gas traffic-light indicators</w:t>
+              <w:t>the green/red lights showing if the air is safe</w:t>
             </w:r>
           </w:p>
         </w:tc>
@@ -1875,7 +2408,7 @@
           </w:tcPr>
           <w:p>
             <w:r>
-              <w:t>red</w:t>
+              <w:t>red (oxygen low)</w:t>
             </w:r>
           </w:p>
         </w:tc>
@@ -1901,7 +2434,7 @@
         <w:t>SIF</w:t>
       </w:r>
       <w:r>
-        <w:t xml:space="preserve"> is one self-contained protective function. The PLC has </w:t>
+        <w:t xml:space="preserve"> (Safety Instrumented Function — one self-contained protective job, made of its own sensors, logic and outputs) is one complete piece of protection. The PLC has </w:t>
       </w:r>
       <w:r>
         <w:rPr>
@@ -1910,7 +2443,76 @@
         <w:t>12</w:t>
       </w:r>
       <w:r>
-        <w:t xml:space="preserve"> (SIF-01…11 and SIF-13 — there is no SIF-12 in the PLC; the C&amp;E lists the oxygen function as "SIF 11 &amp; 12"). One-line summary of each:</w:t>
+        <w:t xml:space="preserve"> of them (SIF-01…11 and SIF-13). There is no SIF-12 in the PLC; the C&amp;E sheet lists the oxygen job as "SIF 11 &amp; 12". A few terms used below:</w:t>
+      </w:r>
+    </w:p>
+    <w:p>
+      <w:pPr>
+        <w:pStyle w:val="ListBullet"/>
+      </w:pPr>
+      <w:r>
+        <w:rPr>
+          <w:b/>
+        </w:rPr>
+        <w:t>permissive</w:t>
+      </w:r>
+      <w:r>
+        <w:t xml:space="preserve"> = a signal that means "it is OK to proceed". A permissive is </w:t>
+      </w:r>
+      <w:r>
+        <w:rPr>
+          <w:rFonts w:ascii="Consolas" w:hAnsi="Consolas"/>
+          <w:color w:val="C7254E"/>
+          <w:sz w:val="19"/>
+        </w:rPr>
+        <w:t>1</w:t>
+      </w:r>
+      <w:r>
+        <w:t xml:space="preserve"> when healthy and drops to </w:t>
+      </w:r>
+      <w:r>
+        <w:rPr>
+          <w:rFonts w:ascii="Consolas" w:hAnsi="Consolas"/>
+          <w:color w:val="C7254E"/>
+          <w:sz w:val="19"/>
+        </w:rPr>
+        <w:t>0</w:t>
+      </w:r>
+      <w:r>
+        <w:t xml:space="preserve"> to trip.</w:t>
+      </w:r>
+    </w:p>
+    <w:p>
+      <w:pPr>
+        <w:pStyle w:val="ListBullet"/>
+      </w:pPr>
+      <w:r>
+        <w:rPr>
+          <w:b/>
+        </w:rPr>
+        <w:t>latch</w:t>
+      </w:r>
+      <w:r>
+        <w:t xml:space="preserve"> = a memory bit that stays tripped after the cause clears, until someone presses a reset button.</w:t>
+      </w:r>
+    </w:p>
+    <w:p>
+      <w:pPr>
+        <w:pStyle w:val="ListBullet"/>
+      </w:pPr>
+      <w:r>
+        <w:rPr>
+          <w:b/>
+        </w:rPr>
+        <w:t>SFC</w:t>
+      </w:r>
+      <w:r>
+        <w:t xml:space="preserve"> = Sequential Function Chart — a step-by-step program (a state machine) that walks through one stage at a time. The search uses one.</w:t>
+      </w:r>
+    </w:p>
+    <w:p>
+      <w:r>
+        <w:t>One-line summary of each SIF:</w:t>
       </w:r>
     </w:p>
     <w:tbl>
@@ -1995,10 +2597,10 @@
               <w:rPr>
                 <w:b/>
               </w:rPr>
-              <w:t>general door</w:t>
-            </w:r>
-            <w:r>
-              <w:t xml:space="preserve"> with beam on</w:t>
+              <w:t>main personnel door</w:t>
+            </w:r>
+            <w:r>
+              <w:t xml:space="preserve"> while the beam is on</w:t>
             </w:r>
           </w:p>
         </w:tc>
@@ -2008,7 +2610,26 @@
           </w:tcPr>
           <w:p>
             <w:r>
-              <w:t>GADC 2oo3 → drop CON01-03</w:t>
+              <w:rPr>
+                <w:rFonts w:ascii="Consolas" w:hAnsi="Consolas"/>
+                <w:color w:val="C7254E"/>
+                <w:sz w:val="19"/>
+              </w:rPr>
+              <w:t>GADC-01..03</w:t>
+            </w:r>
+            <w:r>
+              <w:t xml:space="preserve"> (main-door closed-switches) 2oo3 → open </w:t>
+            </w:r>
+            <w:r>
+              <w:rPr>
+                <w:rFonts w:ascii="Consolas" w:hAnsi="Consolas"/>
+                <w:color w:val="C7254E"/>
+                <w:sz w:val="19"/>
+              </w:rPr>
+              <w:t>CON-01..03</w:t>
+            </w:r>
+            <w:r>
+              <w:t xml:space="preserve"> (electron-source contactors)</w:t>
             </w:r>
           </w:p>
         </w:tc>
@@ -2046,7 +2667,26 @@
           </w:tcPr>
           <w:p>
             <w:r>
-              <w:t>SADC 2oo3/1oo2 → drop CON01-03</w:t>
+              <w:rPr>
+                <w:rFonts w:ascii="Consolas" w:hAnsi="Consolas"/>
+                <w:color w:val="C7254E"/>
+                <w:sz w:val="19"/>
+              </w:rPr>
+              <w:t>SADC</w:t>
+            </w:r>
+            <w:r>
+              <w:t xml:space="preserve"> (service-door closed-switches) 2oo3 / 1oo2 → open </w:t>
+            </w:r>
+            <w:r>
+              <w:rPr>
+                <w:rFonts w:ascii="Consolas" w:hAnsi="Consolas"/>
+                <w:color w:val="C7254E"/>
+                <w:sz w:val="19"/>
+              </w:rPr>
+              <w:t>CON-01..03</w:t>
+            </w:r>
+            <w:r>
+              <w:t xml:space="preserve"> (electron-source contactors)</w:t>
             </w:r>
           </w:p>
         </w:tc>
@@ -2068,13 +2708,13 @@
           </w:tcPr>
           <w:p>
             <w:r>
-              <w:t xml:space="preserve">unlocking doors while </w:t>
+              <w:t xml:space="preserve">unlocking the doors while </w:t>
             </w:r>
             <w:r>
               <w:rPr>
                 <w:b/>
               </w:rPr>
-              <w:t>radiation still present</w:t>
+              <w:t>radiation is still present</w:t>
             </w:r>
           </w:p>
         </w:tc>
@@ -2084,7 +2724,26 @@
           </w:tcPr>
           <w:p>
             <w:r>
-              <w:t>IT/VT 2oo3 → keep locks ON until source reads 0 for 20 s + Open/Reset</w:t>
+              <w:rPr>
+                <w:rFonts w:ascii="Consolas" w:hAnsi="Consolas"/>
+                <w:color w:val="C7254E"/>
+                <w:sz w:val="19"/>
+              </w:rPr>
+              <w:t>IT</w:t>
+            </w:r>
+            <w:r>
+              <w:t>/</w:t>
+            </w:r>
+            <w:r>
+              <w:rPr>
+                <w:rFonts w:ascii="Consolas" w:hAnsi="Consolas"/>
+                <w:color w:val="C7254E"/>
+                <w:sz w:val="19"/>
+              </w:rPr>
+              <w:t>VT</w:t>
+            </w:r>
+            <w:r>
+              <w:t xml:space="preserve"> (current/voltage transmitters) 2oo3 → keep the door locks ON until the source reads 0 for 20 s, then Open/Reset is pressed</w:t>
             </w:r>
           </w:p>
         </w:tc>
@@ -2106,13 +2765,16 @@
           </w:tcPr>
           <w:p>
             <w:r>
+              <w:t xml:space="preserve">a fault in </w:t>
+            </w:r>
+            <w:r>
               <w:rPr>
                 <w:b/>
               </w:rPr>
               <w:t>the search itself</w:t>
             </w:r>
             <w:r>
-              <w:t xml:space="preserve"> (the SFC state machine)</w:t>
+              <w:t xml:space="preserve"> (the SFC step machine)</w:t>
             </w:r>
           </w:p>
         </w:tc>
@@ -2122,7 +2784,18 @@
           </w:tcPr>
           <w:p>
             <w:r>
-              <w:t>sequence → status flags</w:t>
+              <w:t xml:space="preserve">search sequence → </w:t>
+            </w:r>
+            <w:r>
+              <w:rPr>
+                <w:rFonts w:ascii="Consolas" w:hAnsi="Consolas"/>
+                <w:color w:val="C7254E"/>
+                <w:sz w:val="19"/>
+              </w:rPr>
+              <w:t>STATUS-</w:t>
+            </w:r>
+            <w:r>
+              <w:t xml:space="preserve"> flags (the bits that show which step the search is on)</w:t>
             </w:r>
           </w:p>
         </w:tc>
@@ -2154,7 +2827,26 @@
           </w:tcPr>
           <w:p>
             <w:r>
-              <w:t>card + keys + doors → permit T1</w:t>
+              <w:rPr>
+                <w:rFonts w:ascii="Consolas" w:hAnsi="Consolas"/>
+                <w:color w:val="C7254E"/>
+                <w:sz w:val="19"/>
+              </w:rPr>
+              <w:t>SCR</w:t>
+            </w:r>
+            <w:r>
+              <w:t xml:space="preserve"> (search card) + </w:t>
+            </w:r>
+            <w:r>
+              <w:rPr>
+                <w:rFonts w:ascii="Consolas" w:hAnsi="Consolas"/>
+                <w:color w:val="C7254E"/>
+                <w:sz w:val="19"/>
+              </w:rPr>
+              <w:t>KEY</w:t>
+            </w:r>
+            <w:r>
+              <w:t xml:space="preserve"> (enable keys) + doors shut → grant the start permit (transition T1)</w:t>
             </w:r>
           </w:p>
         </w:tc>
@@ -2176,7 +2868,7 @@
           </w:tcPr>
           <w:p>
             <w:r>
-              <w:t>declaring "searched" with a door open</w:t>
+              <w:t>declaring "searched" while a door is still open</w:t>
             </w:r>
           </w:p>
         </w:tc>
@@ -2186,7 +2878,15 @@
           </w:tcPr>
           <w:p>
             <w:r>
-              <w:t>GADC + gate 2oo3 → permit T7</w:t>
+              <w:rPr>
+                <w:rFonts w:ascii="Consolas" w:hAnsi="Consolas"/>
+                <w:color w:val="C7254E"/>
+                <w:sz w:val="19"/>
+              </w:rPr>
+              <w:t>GADC</w:t>
+            </w:r>
+            <w:r>
+              <w:t xml:space="preserve"> (main-door) + gate closed-switches 2oo3 → grant the search-complete permit (transition T7)</w:t>
             </w:r>
           </w:p>
         </w:tc>
@@ -2208,7 +2908,7 @@
           </w:tcPr>
           <w:p>
             <w:r>
-              <w:t>turning beam on before locks confirmed</w:t>
+              <w:t>turning the beam on before the door locks are confirmed</w:t>
             </w:r>
           </w:p>
         </w:tc>
@@ -2218,7 +2918,29 @@
           </w:tcPr>
           <w:p>
             <w:r>
-              <w:t>lock feedback + 180 s → beam permit</w:t>
+              <w:t>lock feedback (</w:t>
+            </w:r>
+            <w:r>
+              <w:rPr>
+                <w:rFonts w:ascii="Consolas" w:hAnsi="Consolas"/>
+                <w:color w:val="C7254E"/>
+                <w:sz w:val="19"/>
+              </w:rPr>
+              <w:t>GADL</w:t>
+            </w:r>
+            <w:r>
+              <w:t>/</w:t>
+            </w:r>
+            <w:r>
+              <w:rPr>
+                <w:rFonts w:ascii="Consolas" w:hAnsi="Consolas"/>
+                <w:color w:val="C7254E"/>
+                <w:sz w:val="19"/>
+              </w:rPr>
+              <w:t>SADL</w:t>
+            </w:r>
+            <w:r>
+              <w:t xml:space="preserve"> locked-switches) + a 180 s wait → grant the beam-on permit</w:t>
             </w:r>
           </w:p>
         </w:tc>
@@ -2246,7 +2968,7 @@
               <w:t>emergency stop</w:t>
             </w:r>
             <w:r>
-              <w:t xml:space="preserve"> — any beam-off button</w:t>
+              <w:t xml:space="preserve"> — any beam-off button pressed</w:t>
             </w:r>
           </w:p>
         </w:tc>
@@ -2256,7 +2978,37 @@
           </w:tcPr>
           <w:p>
             <w:r>
-              <w:t>BOB 1oo7 → drop CON01-03,06-10</w:t>
+              <w:rPr>
+                <w:rFonts w:ascii="Consolas" w:hAnsi="Consolas"/>
+                <w:color w:val="C7254E"/>
+                <w:sz w:val="19"/>
+              </w:rPr>
+              <w:t>BOB-01..08</w:t>
+            </w:r>
+            <w:r>
+              <w:t xml:space="preserve"> (beam-off buttons) 1oo7 → open </w:t>
+            </w:r>
+            <w:r>
+              <w:rPr>
+                <w:rFonts w:ascii="Consolas" w:hAnsi="Consolas"/>
+                <w:color w:val="C7254E"/>
+                <w:sz w:val="19"/>
+              </w:rPr>
+              <w:t>CON-01..03</w:t>
+            </w:r>
+            <w:r>
+              <w:t xml:space="preserve"> and </w:t>
+            </w:r>
+            <w:r>
+              <w:rPr>
+                <w:rFonts w:ascii="Consolas" w:hAnsi="Consolas"/>
+                <w:color w:val="C7254E"/>
+                <w:sz w:val="19"/>
+              </w:rPr>
+              <w:t>CON-06..10</w:t>
+            </w:r>
+            <w:r>
+              <w:t xml:space="preserve"> (electron-source and RF contactors)</w:t>
             </w:r>
           </w:p>
         </w:tc>
@@ -2294,7 +3046,34 @@
           </w:tcPr>
           <w:p>
             <w:r>
-              <w:t>RDMN 1oo2 → drop CON01-03,09</w:t>
+              <w:rPr>
+                <w:rFonts w:ascii="Consolas" w:hAnsi="Consolas"/>
+                <w:color w:val="C7254E"/>
+                <w:sz w:val="19"/>
+              </w:rPr>
+              <w:t>RDMN-01..02</w:t>
+            </w:r>
+            <w:r>
+              <w:t xml:space="preserve"> (radiation monitors) 1oo2 → open </w:t>
+            </w:r>
+            <w:r>
+              <w:rPr>
+                <w:rFonts w:ascii="Consolas" w:hAnsi="Consolas"/>
+                <w:color w:val="C7254E"/>
+                <w:sz w:val="19"/>
+              </w:rPr>
+              <w:t>CON-01..03</w:t>
+            </w:r>
+            <w:r>
+              <w:t xml:space="preserve"> and </w:t>
+            </w:r>
+            <w:r>
+              <w:rPr>
+                <w:rFonts w:ascii="Consolas" w:hAnsi="Consolas"/>
+                <w:color w:val="C7254E"/>
+                <w:sz w:val="19"/>
+              </w:rPr>
+              <w:t>CON-09</w:t>
             </w:r>
           </w:p>
         </w:tc>
@@ -2316,7 +3095,7 @@
           </w:tcPr>
           <w:p>
             <w:r>
-              <w:t xml:space="preserve">RF enabled without the </w:t>
+              <w:t xml:space="preserve">the RF being enabled without the </w:t>
             </w:r>
             <w:r>
               <w:rPr>
@@ -2332,7 +3111,26 @@
           </w:tcPr>
           <w:p>
             <w:r>
-              <w:t>KEY03 → drop CON06-10</w:t>
+              <w:rPr>
+                <w:rFonts w:ascii="Consolas" w:hAnsi="Consolas"/>
+                <w:color w:val="C7254E"/>
+                <w:sz w:val="19"/>
+              </w:rPr>
+              <w:t>KEY-03</w:t>
+            </w:r>
+            <w:r>
+              <w:t xml:space="preserve"> (electron-source enable key at the rack) → open </w:t>
+            </w:r>
+            <w:r>
+              <w:rPr>
+                <w:rFonts w:ascii="Consolas" w:hAnsi="Consolas"/>
+                <w:color w:val="C7254E"/>
+                <w:sz w:val="19"/>
+              </w:rPr>
+              <w:t>CON-06..10</w:t>
+            </w:r>
+            <w:r>
+              <w:t xml:space="preserve"> (RF contactors)</w:t>
             </w:r>
           </w:p>
         </w:tc>
@@ -2359,6 +3157,9 @@
               </w:rPr>
               <w:t>oxygen depletion</w:t>
             </w:r>
+            <w:r>
+              <w:t xml:space="preserve"> (air unsafe to breathe)</w:t>
+            </w:r>
           </w:p>
         </w:tc>
         <w:tc>
@@ -2367,7 +3168,26 @@
           </w:tcPr>
           <w:p>
             <w:r>
-              <w:t>OXMON 1oo4 → close LN2 valve, alarm</w:t>
+              <w:rPr>
+                <w:rFonts w:ascii="Consolas" w:hAnsi="Consolas"/>
+                <w:color w:val="C7254E"/>
+                <w:sz w:val="19"/>
+              </w:rPr>
+              <w:t>OXMON-01..04</w:t>
+            </w:r>
+            <w:r>
+              <w:t xml:space="preserve"> (oxygen monitors) 1oo4 → close the </w:t>
+            </w:r>
+            <w:r>
+              <w:rPr>
+                <w:rFonts w:ascii="Consolas" w:hAnsi="Consolas"/>
+                <w:color w:val="C7254E"/>
+                <w:sz w:val="19"/>
+              </w:rPr>
+              <w:t>SDVLN2</w:t>
+            </w:r>
+            <w:r>
+              <w:t xml:space="preserve"> liquid-nitrogen valve and raise the alarm</w:t>
             </w:r>
           </w:p>
         </w:tc>
@@ -2395,7 +3215,7 @@
               <w:rPr>
                 <w:b/>
               </w:rPr>
-              <w:t>gate</w:t>
+              <w:t>entrance gate</w:t>
             </w:r>
           </w:p>
         </w:tc>
@@ -2405,7 +3225,26 @@
           </w:tcPr>
           <w:p>
             <w:r>
-              <w:t>GADC gate 2oo3 → drop CON06-08 (200 ms)</w:t>
+              <w:rPr>
+                <w:rFonts w:ascii="Consolas" w:hAnsi="Consolas"/>
+                <w:color w:val="C7254E"/>
+                <w:sz w:val="19"/>
+              </w:rPr>
+              <w:t>GADC-04..06</w:t>
+            </w:r>
+            <w:r>
+              <w:t xml:space="preserve"> (gate closed-switches) 2oo3 → open </w:t>
+            </w:r>
+            <w:r>
+              <w:rPr>
+                <w:rFonts w:ascii="Consolas" w:hAnsi="Consolas"/>
+                <w:color w:val="C7254E"/>
+                <w:sz w:val="19"/>
+              </w:rPr>
+              <w:t>CON-06..08</w:t>
+            </w:r>
+            <w:r>
+              <w:t xml:space="preserve"> (3-phase RF contactors) within 200 ms</w:t>
             </w:r>
           </w:p>
         </w:tc>
@@ -2414,54 +3253,7 @@
     <w:p/>
     <w:p>
       <w:r>
-        <w:t xml:space="preserve">The exact gate logic, latching and timers are in </w:t>
-      </w:r>
-      <w:r>
-        <w:rPr>
-          <w:rFonts w:ascii="Consolas" w:hAnsi="Consolas"/>
-          <w:color w:val="C7254E"/>
-          <w:sz w:val="19"/>
-        </w:rPr>
-        <w:t>04_PROGRAM_LOGIC_REFERENCE.md</w:t>
-      </w:r>
-      <w:r>
-        <w:t>.</w:t>
-      </w:r>
-    </w:p>
-    <w:p>
-      <w:r>
-        <w:rPr>
-          <w:color w:val="BBBBBB"/>
-        </w:rPr>
-        <w:t>__________________________________________________</w:t>
-      </w:r>
-    </w:p>
-    <w:p>
-      <w:pPr>
-        <w:pStyle w:val="Heading3"/>
-      </w:pPr>
-      <w:r>
-        <w:t>Try it now</w:t>
-      </w:r>
-    </w:p>
-    <w:p>
-      <w:pPr>
-        <w:spacing w:after="120"/>
-        <w:ind w:left="288"/>
-        <w:shd w:val="clear" w:fill="F2F2F2"/>
-      </w:pPr>
-      <w:r>
-        <w:rPr>
-          <w:rFonts w:ascii="Consolas" w:hAnsi="Consolas"/>
-          <w:sz w:val="18"/>
-        </w:rPr>
-        <w:t>python3 pss_cli.py</w:t>
-        <w:br/>
-        <w:t>pss&gt; ai OXMON02 18        # one oxygen monitor reads 18% (&lt; 19.5 trip)  -&gt; SIF-11</w:t>
-        <w:br/>
-        <w:t>pss&gt; state                # LN2 valve CLOSES, O2 lights go RED</w:t>
-        <w:br/>
-        <w:t>pss&gt; reset GAS            # clear it (after O2 restored)</w:t>
+        <w:t>The exact gate logic, latching and timers are in document 03 (the Program logic reference). To drive any of these functions yourself and watch the result, follow document 04 (the SILworX offline test procedure).</w:t>
       </w:r>
     </w:p>
     <w:sectPr>

</xml_diff>